<commit_message>
report crimes and news sections add
</commit_message>
<xml_diff>
--- a/report/вестник.docx
+++ b/report/вестник.docx
@@ -2847,25 +2847,7 @@
           <w:szCs w:val="28"/>
           <w:lang w:val="en-US"/>
         </w:rPr>
-        <w:t xml:space="preserve">here is currently a lack of predictive models tailored to Kazakhstan’s corruption landscape. This study aims to bridge this gap by developing and evaluating machine learning models to forecast </w:t>
-      </w:r>
-      <w:proofErr w:type="gramStart"/>
-      <w:r>
-        <w:rPr>
-          <w:sz w:val="28"/>
-          <w:szCs w:val="28"/>
-          <w:lang w:val="en-US"/>
-        </w:rPr>
-        <w:t>corruption</w:t>
-      </w:r>
-      <w:proofErr w:type="gramEnd"/>
-      <w:r>
-        <w:rPr>
-          <w:sz w:val="28"/>
-          <w:szCs w:val="28"/>
-          <w:lang w:val="en-US"/>
-        </w:rPr>
-        <w:t xml:space="preserve"> crime trends based on historical crime reports</w:t>
+        <w:t>here is currently a lack of predictive models tailored to Kazakhstan’s corruption landscape. This study aims to bridge this gap by developing and evaluating machine learning models to forecast corruption crime trends based on historical crime reports</w:t>
       </w:r>
       <w:r>
         <w:rPr>
@@ -2976,7 +2958,42 @@
           <w:szCs w:val="28"/>
           <w:lang w:val="en-US"/>
         </w:rPr>
-        <w:t xml:space="preserve">Oxford Insights identifies synthetic intelligence </w:t>
+        <w:t xml:space="preserve">Oxford Insights identifies synthetic intelligence as ”the following frontier in anticorruption” because of its functionality to hit upon styles in datasets which might be too huge for human analysis. By leveraging AI to pinpoint elements of interest, humans can concentrate on examining specifics and investigating potential instances of misuse, fraud, or corruption. [6] </w:t>
+      </w:r>
+    </w:p>
+    <w:p>
+      <w:pPr>
+        <w:rPr>
+          <w:sz w:val="28"/>
+          <w:szCs w:val="28"/>
+          <w:lang w:val="en-US"/>
+        </w:rPr>
+      </w:pPr>
+      <w:r>
+        <w:rPr>
+          <w:sz w:val="28"/>
+          <w:szCs w:val="28"/>
+          <w:lang w:val="en-US"/>
+        </w:rPr>
+        <w:t xml:space="preserve">Top-down tactics are primarily based totally at the perception that establishments are fashioned with the aid of using legal guidelines created with the aid of using political leaders. As a result, those anti-corruption projects attempt to result in </w:t>
+      </w:r>
+      <w:proofErr w:type="spellStart"/>
+      <w:r>
+        <w:rPr>
+          <w:sz w:val="28"/>
+          <w:szCs w:val="28"/>
+          <w:lang w:val="en-US"/>
+        </w:rPr>
+        <w:t>extrade</w:t>
+      </w:r>
+      <w:proofErr w:type="spellEnd"/>
+      <w:r>
+        <w:rPr>
+          <w:sz w:val="28"/>
+          <w:szCs w:val="28"/>
+          <w:lang w:val="en-US"/>
+        </w:rPr>
+        <w:t xml:space="preserve"> with the aid of </w:t>
       </w:r>
       <w:proofErr w:type="gramStart"/>
       <w:r>
@@ -2985,7 +3002,7 @@
           <w:szCs w:val="28"/>
           <w:lang w:val="en-US"/>
         </w:rPr>
-        <w:t>as ”the</w:t>
+        <w:t>using introducing</w:t>
       </w:r>
       <w:proofErr w:type="gramEnd"/>
       <w:r>
@@ -2994,24 +3011,7 @@
           <w:szCs w:val="28"/>
           <w:lang w:val="en-US"/>
         </w:rPr>
-        <w:t xml:space="preserve"> following frontier in anticorruption” because of its functionality to hit upon styles in datasets which might be too huge for human analysis. By leveraging AI to pinpoint elements of interest, humans can concentrate on examining specifics and investigating potential instances of misuse, fraud, or corruption. [6] </w:t>
-      </w:r>
-    </w:p>
-    <w:p>
-      <w:pPr>
-        <w:rPr>
-          <w:sz w:val="28"/>
-          <w:szCs w:val="28"/>
-          <w:lang w:val="en-US"/>
-        </w:rPr>
-      </w:pPr>
-      <w:r>
-        <w:rPr>
-          <w:sz w:val="28"/>
-          <w:szCs w:val="28"/>
-          <w:lang w:val="en-US"/>
-        </w:rPr>
-        <w:t xml:space="preserve">Top-down tactics are primarily based totally </w:t>
+        <w:t xml:space="preserve"> new legal guidelines, regulations, and approaches inside public administration. In contrast, bottom-up tactics view establishments as growing certainly via social norms, customs, traditions, beliefs, and values inside society. These </w:t>
       </w:r>
       <w:proofErr w:type="gramStart"/>
       <w:r>
@@ -3020,7 +3020,7 @@
           <w:szCs w:val="28"/>
           <w:lang w:val="en-US"/>
         </w:rPr>
-        <w:t>at</w:t>
+        <w:t>efforts</w:t>
       </w:r>
       <w:proofErr w:type="gramEnd"/>
       <w:r>
@@ -3029,25 +3029,24 @@
           <w:szCs w:val="28"/>
           <w:lang w:val="en-US"/>
         </w:rPr>
-        <w:t xml:space="preserve"> the perception that establishments are fashioned with the aid of using legal guidelines created with the aid of using political leaders. As a result, those anti-corruption projects attempt to result in </w:t>
-      </w:r>
-      <w:proofErr w:type="spellStart"/>
-      <w:r>
-        <w:rPr>
-          <w:sz w:val="28"/>
-          <w:szCs w:val="28"/>
-          <w:lang w:val="en-US"/>
-        </w:rPr>
-        <w:t>extrade</w:t>
-      </w:r>
-      <w:proofErr w:type="spellEnd"/>
-      <w:r>
-        <w:rPr>
-          <w:sz w:val="28"/>
-          <w:szCs w:val="28"/>
-          <w:lang w:val="en-US"/>
-        </w:rPr>
-        <w:t xml:space="preserve"> with the aid of </w:t>
+        <w:t xml:space="preserve"> attention on information the cultural and societal context to perceive and help present projects that goal to lessen corrupt practices. This method mainly is based at the involvement of lively civil society groups and reporters who can act as watchdogs. [7] </w:t>
+      </w:r>
+    </w:p>
+    <w:p>
+      <w:pPr>
+        <w:rPr>
+          <w:sz w:val="28"/>
+          <w:szCs w:val="28"/>
+          <w:lang w:val="en-US"/>
+        </w:rPr>
+      </w:pPr>
+      <w:r>
+        <w:rPr>
+          <w:sz w:val="28"/>
+          <w:szCs w:val="28"/>
+          <w:lang w:val="en-US"/>
+        </w:rPr>
+        <w:t xml:space="preserve">Another </w:t>
       </w:r>
       <w:proofErr w:type="gramStart"/>
       <w:r>
@@ -3056,7 +3055,7 @@
           <w:szCs w:val="28"/>
           <w:lang w:val="en-US"/>
         </w:rPr>
-        <w:t>using introducing</w:t>
+        <w:t>observe</w:t>
       </w:r>
       <w:proofErr w:type="gramEnd"/>
       <w:r>
@@ -3065,7 +3064,7 @@
           <w:szCs w:val="28"/>
           <w:lang w:val="en-US"/>
         </w:rPr>
-        <w:t xml:space="preserve"> new legal guidelines, regulations, and approaches inside public administration. In contrast, bottom-up tactics view establishments as growing certainly via social norms, customs, traditions, beliefs, and values inside society. These </w:t>
+        <w:t xml:space="preserve"> explores the phenomenon from a predictive analytics standpoint, the usage of </w:t>
       </w:r>
       <w:proofErr w:type="gramStart"/>
       <w:r>
@@ -3074,7 +3073,7 @@
           <w:szCs w:val="28"/>
           <w:lang w:val="en-US"/>
         </w:rPr>
-        <w:t>efforts</w:t>
+        <w:t>present day</w:t>
       </w:r>
       <w:proofErr w:type="gramEnd"/>
       <w:r>
@@ -3083,60 +3082,7 @@
           <w:szCs w:val="28"/>
           <w:lang w:val="en-US"/>
         </w:rPr>
-        <w:t xml:space="preserve"> attention on information the cultural and societal context to perceive and help present projects that goal to lessen corrupt practices. This method mainly is based </w:t>
-      </w:r>
-      <w:proofErr w:type="gramStart"/>
-      <w:r>
-        <w:rPr>
-          <w:sz w:val="28"/>
-          <w:szCs w:val="28"/>
-          <w:lang w:val="en-US"/>
-        </w:rPr>
-        <w:t>at</w:t>
-      </w:r>
-      <w:proofErr w:type="gramEnd"/>
-      <w:r>
-        <w:rPr>
-          <w:sz w:val="28"/>
-          <w:szCs w:val="28"/>
-          <w:lang w:val="en-US"/>
-        </w:rPr>
-        <w:t xml:space="preserve"> the involvement of lively civil society groups and reporters who can act as watchdogs. [7] </w:t>
-      </w:r>
-    </w:p>
-    <w:p>
-      <w:pPr>
-        <w:rPr>
-          <w:sz w:val="28"/>
-          <w:szCs w:val="28"/>
-          <w:lang w:val="en-US"/>
-        </w:rPr>
-      </w:pPr>
-      <w:r>
-        <w:rPr>
-          <w:sz w:val="28"/>
-          <w:szCs w:val="28"/>
-          <w:lang w:val="en-US"/>
-        </w:rPr>
-        <w:t xml:space="preserve">Another </w:t>
-      </w:r>
-      <w:proofErr w:type="gramStart"/>
-      <w:r>
-        <w:rPr>
-          <w:sz w:val="28"/>
-          <w:szCs w:val="28"/>
-          <w:lang w:val="en-US"/>
-        </w:rPr>
-        <w:t>observe</w:t>
-      </w:r>
-      <w:proofErr w:type="gramEnd"/>
-      <w:r>
-        <w:rPr>
-          <w:sz w:val="28"/>
-          <w:szCs w:val="28"/>
-          <w:lang w:val="en-US"/>
-        </w:rPr>
-        <w:t xml:space="preserve"> explores the phenomenon from a predictive analytics standpoint, the usage of present day system getting to know strategies to pinpoint </w:t>
+        <w:t xml:space="preserve"> system getting to know strategies to pinpoint </w:t>
       </w:r>
       <w:r>
         <w:rPr>
@@ -3522,43 +3468,7 @@
           <w:szCs w:val="28"/>
           <w:lang w:val="en-US"/>
         </w:rPr>
-        <w:t xml:space="preserve"> Authority in Italy on public procurement and the judges’ sentences related to public procurement, published on the website of the Italian Administrative Justice from 2007 to 2022. </w:t>
-      </w:r>
-      <w:proofErr w:type="gramStart"/>
-      <w:r>
-        <w:rPr>
-          <w:sz w:val="28"/>
-          <w:szCs w:val="28"/>
-          <w:lang w:val="en-US"/>
-        </w:rPr>
-        <w:t>First</w:t>
-      </w:r>
-      <w:proofErr w:type="gramEnd"/>
-      <w:r>
-        <w:rPr>
-          <w:sz w:val="28"/>
-          <w:szCs w:val="28"/>
-          <w:lang w:val="en-US"/>
-        </w:rPr>
-        <w:t xml:space="preserve"> goal was to train machine learning models capable of automatically recognizing which procurement has led to disputes and consequently complaints to the Administrative Justice, identifying the relevant features of procurement that correspond to certain anomalies. </w:t>
-      </w:r>
-      <w:proofErr w:type="gramStart"/>
-      <w:r>
-        <w:rPr>
-          <w:sz w:val="28"/>
-          <w:szCs w:val="28"/>
-          <w:lang w:val="en-US"/>
-        </w:rPr>
-        <w:t>Second</w:t>
-      </w:r>
-      <w:proofErr w:type="gramEnd"/>
-      <w:r>
-        <w:rPr>
-          <w:sz w:val="28"/>
-          <w:szCs w:val="28"/>
-          <w:lang w:val="en-US"/>
-        </w:rPr>
-        <w:t xml:space="preserve"> goal was to develop a recommender system on procurement to return similar procurement to a given one and find companies for bidders, depending on the procurement requirements. [19]</w:t>
+        <w:t xml:space="preserve"> Authority in Italy on public procurement and the judges’ sentences related to public procurement, published on the website of the Italian Administrative Justice from 2007 to 2022. First goal was to train machine learning models capable of automatically recognizing which procurement has led to disputes and consequently complaints to the Administrative Justice, identifying the relevant features of procurement that correspond to certain anomalies. Second goal was to develop a recommender system on procurement to return similar procurement to a given one and find companies for bidders, depending on the procurement requirements. [19]</w:t>
       </w:r>
     </w:p>
     <w:p>
@@ -3887,23 +3797,13 @@
           <w:lang w:val="en-US"/>
         </w:rPr>
       </w:pPr>
-      <w:proofErr w:type="gramStart"/>
-      <w:r>
-        <w:rPr>
-          <w:sz w:val="28"/>
-          <w:szCs w:val="28"/>
-          <w:lang w:val="en-US"/>
-        </w:rPr>
-        <w:t>First</w:t>
-      </w:r>
-      <w:proofErr w:type="gramEnd"/>
-      <w:r>
-        <w:rPr>
-          <w:sz w:val="28"/>
-          <w:szCs w:val="28"/>
-          <w:lang w:val="en-US"/>
-        </w:rPr>
-        <w:t xml:space="preserve"> step is data collecting. To collect </w:t>
+      <w:r>
+        <w:rPr>
+          <w:sz w:val="28"/>
+          <w:szCs w:val="28"/>
+          <w:lang w:val="en-US"/>
+        </w:rPr>
+        <w:t xml:space="preserve">First step is data collecting. To collect </w:t>
       </w:r>
       <w:proofErr w:type="gramStart"/>
       <w:r>
@@ -4036,6 +3936,25 @@
           <w:lang w:val="en-US"/>
         </w:rPr>
       </w:pPr>
+    </w:p>
+    <w:p>
+      <w:pPr>
+        <w:ind w:firstLine="0"/>
+        <w:jc w:val="left"/>
+        <w:rPr>
+          <w:sz w:val="28"/>
+          <w:szCs w:val="28"/>
+          <w:lang w:val="en-US"/>
+        </w:rPr>
+      </w:pPr>
+      <w:r>
+        <w:rPr>
+          <w:sz w:val="28"/>
+          <w:szCs w:val="28"/>
+          <w:lang w:val="en-US"/>
+        </w:rPr>
+        <w:t>Table 1 The example of one row from the dataset. The numbers of corruption crimes in November of 2023.</w:t>
+      </w:r>
     </w:p>
     <w:tbl>
       <w:tblPr>
@@ -5682,65 +5601,6 @@
     </w:p>
     <w:p>
       <w:pPr>
-        <w:jc w:val="center"/>
-        <w:rPr>
-          <w:sz w:val="28"/>
-          <w:szCs w:val="28"/>
-          <w:lang w:val="en-US"/>
-        </w:rPr>
-      </w:pPr>
-      <w:r>
-        <w:rPr>
-          <w:sz w:val="28"/>
-          <w:szCs w:val="28"/>
-          <w:lang w:val="en-US"/>
-        </w:rPr>
-        <w:t>Table 1. The example of one row from the dataset. The</w:t>
-      </w:r>
-      <w:r>
-        <w:rPr>
-          <w:sz w:val="28"/>
-          <w:szCs w:val="28"/>
-          <w:lang w:val="en-US"/>
-        </w:rPr>
-        <w:t xml:space="preserve"> numbers of corruption crimes</w:t>
-      </w:r>
-      <w:r>
-        <w:rPr>
-          <w:sz w:val="28"/>
-          <w:szCs w:val="28"/>
-          <w:lang w:val="en-US"/>
-        </w:rPr>
-        <w:t xml:space="preserve"> </w:t>
-      </w:r>
-      <w:r>
-        <w:rPr>
-          <w:sz w:val="28"/>
-          <w:szCs w:val="28"/>
-          <w:lang w:val="en-US"/>
-        </w:rPr>
-        <w:t>i</w:t>
-      </w:r>
-      <w:r>
-        <w:rPr>
-          <w:sz w:val="28"/>
-          <w:szCs w:val="28"/>
-          <w:lang w:val="en-US"/>
-        </w:rPr>
-        <w:t>n November of 2023.</w:t>
-      </w:r>
-    </w:p>
-    <w:p>
-      <w:pPr>
-        <w:rPr>
-          <w:sz w:val="28"/>
-          <w:szCs w:val="28"/>
-          <w:lang w:val="en-US"/>
-        </w:rPr>
-      </w:pPr>
-    </w:p>
-    <w:p>
-      <w:pPr>
         <w:rPr>
           <w:sz w:val="28"/>
           <w:szCs w:val="28"/>
@@ -5789,7 +5649,7 @@
           <w:szCs w:val="28"/>
           <w:lang w:val="en-US"/>
         </w:rPr>
-        <w:t xml:space="preserve"> values with mean. This step ensures that the dataset remains complete and suitable for analysis. We maintain the integrity of the data while minimizing the impact of missing entries on our next steps. In our dataset dates are presented in string data type. We convert them to int. The next step is dividing the dataset into features (denoted as X) and target variable (denoted as y). For the target variable we use </w:t>
+        <w:t xml:space="preserve"> values with mean. This step ensures that the dataset remains complete and suitable for analysis. We maintain the integrity of the data while minimizing the impact of missing entries on our next steps. In our dataset dates are presented in string data type. We convert them to int. The next step is dividing the dataset into features (denoted as X) and target variable (denoted as y). For the target variable we use date column as it showed the best results. After defining the intention </w:t>
       </w:r>
       <w:proofErr w:type="gramStart"/>
       <w:r>
@@ -5798,7 +5658,7 @@
           <w:szCs w:val="28"/>
           <w:lang w:val="en-US"/>
         </w:rPr>
-        <w:t>date</w:t>
+        <w:t>variable</w:t>
       </w:r>
       <w:proofErr w:type="gramEnd"/>
       <w:r>
@@ -5807,7 +5667,7 @@
           <w:szCs w:val="28"/>
           <w:lang w:val="en-US"/>
         </w:rPr>
-        <w:t xml:space="preserve"> column as it showed the best results. After defining the intention </w:t>
+        <w:t xml:space="preserve"> we break up the records into schooling and attempting out gadgets the usage of 80/20 proportion. To enhance the performance of machine learning algorithms. Standardization of features involves subtracting the </w:t>
       </w:r>
       <w:proofErr w:type="gramStart"/>
       <w:r>
@@ -5816,7 +5676,7 @@
           <w:szCs w:val="28"/>
           <w:lang w:val="en-US"/>
         </w:rPr>
-        <w:t>variable</w:t>
+        <w:t>mean</w:t>
       </w:r>
       <w:proofErr w:type="gramEnd"/>
       <w:r>
@@ -5825,25 +5685,7 @@
           <w:szCs w:val="28"/>
           <w:lang w:val="en-US"/>
         </w:rPr>
-        <w:t xml:space="preserve"> we break up the records into schooling and attempting out gadgets the usage of 80/20 proportion. To enhance the performance of machine learning algorithms. Standardization of features involves subtracting the </w:t>
-      </w:r>
-      <w:proofErr w:type="gramStart"/>
-      <w:r>
-        <w:rPr>
-          <w:sz w:val="28"/>
-          <w:szCs w:val="28"/>
-          <w:lang w:val="en-US"/>
-        </w:rPr>
-        <w:t>mean</w:t>
-      </w:r>
-      <w:proofErr w:type="gramEnd"/>
-      <w:r>
-        <w:rPr>
-          <w:sz w:val="28"/>
-          <w:szCs w:val="28"/>
-          <w:lang w:val="en-US"/>
-        </w:rPr>
-        <w:t xml:space="preserve"> and </w:t>
+        <w:t xml:space="preserve"> and scaling to unit variance. This step guarantees that every function contributes </w:t>
       </w:r>
       <w:r>
         <w:rPr>
@@ -5852,7 +5694,7 @@
           <w:lang w:val="en-US"/>
         </w:rPr>
         <w:lastRenderedPageBreak/>
-        <w:t>scaling to unit variance. This step guarantees that every function contributes similarly to the version, stopping capabilities with large scales from disproportionately influencing the version outcomes.</w:t>
+        <w:t>similarly to the version, stopping capabilities with large scales from disproportionately influencing the version outcomes.</w:t>
       </w:r>
     </w:p>
     <w:p>
@@ -6727,7 +6569,6 @@
         <w:t xml:space="preserve"> and the target </w:t>
       </w:r>
       <w:proofErr w:type="spellStart"/>
-      <w:proofErr w:type="gramStart"/>
       <w:r>
         <w:rPr>
           <w:sz w:val="28"/>
@@ -6743,16 +6584,7 @@
           <w:szCs w:val="28"/>
           <w:lang w:val="en-US"/>
         </w:rPr>
-        <w:t xml:space="preserve"> .</w:t>
-      </w:r>
-      <w:proofErr w:type="gramEnd"/>
-      <w:r>
-        <w:rPr>
-          <w:sz w:val="28"/>
-          <w:szCs w:val="28"/>
-          <w:lang w:val="en-US"/>
-        </w:rPr>
-        <w:t xml:space="preserve"> - Ω(f) is a regularization term to prevent overfitting.</w:t>
+        <w:t xml:space="preserve"> . - Ω(f) is a regularization term to prevent overfitting.</w:t>
       </w:r>
     </w:p>
     <w:p>
@@ -7142,25 +6974,7 @@
           <w:szCs w:val="28"/>
           <w:lang w:val="en-US"/>
         </w:rPr>
-        <w:t xml:space="preserve">2, </w:t>
-      </w:r>
-      <w:proofErr w:type="gramStart"/>
-      <w:r>
-        <w:rPr>
-          <w:sz w:val="28"/>
-          <w:szCs w:val="28"/>
-          <w:lang w:val="en-US"/>
-        </w:rPr>
-        <w:t>. . . ,</w:t>
-      </w:r>
-      <w:proofErr w:type="gramEnd"/>
-      <w:r>
-        <w:rPr>
-          <w:sz w:val="28"/>
-          <w:szCs w:val="28"/>
-          <w:lang w:val="en-US"/>
-        </w:rPr>
-        <w:t xml:space="preserve"> </w:t>
+        <w:t xml:space="preserve">2, . . . , </w:t>
       </w:r>
       <w:r>
         <w:rPr>
@@ -7524,17 +7338,7 @@
           <w:szCs w:val="28"/>
           <w:lang w:val="en-US"/>
         </w:rPr>
-        <w:t xml:space="preserve">To evaluate the performance of the regression models, we used three standard metrics: Mean Absolute Error (MAE), Mean Squared Error (MSE), and R-squared (R²) score. These metrics assess the accuracy of predictions by measuring the </w:t>
-      </w:r>
-      <w:r>
-        <w:rPr>
-          <w:rFonts w:eastAsiaTheme="minorEastAsia"/>
-          <w:sz w:val="28"/>
-          <w:szCs w:val="28"/>
-          <w:lang w:val="en-US"/>
-        </w:rPr>
-        <w:lastRenderedPageBreak/>
-        <w:t xml:space="preserve">deviation between actual and predicted values. </w:t>
+        <w:t xml:space="preserve">To evaluate the performance of the regression models, we used three standard metrics: Mean Absolute Error (MAE), Mean Squared Error (MSE), and R-squared (R²) score. These metrics assess the accuracy of predictions by measuring the deviation between actual and predicted values. </w:t>
       </w:r>
       <w:r>
         <w:rPr>
@@ -8499,52 +8303,44 @@
           <w:szCs w:val="28"/>
           <w:lang w:val="en-US"/>
         </w:rPr>
-        <w:t xml:space="preserve"> model captures the general trend in corruption crime numbers but struggles with extreme values and outliers. This suggests that </w:t>
-      </w:r>
-      <w:r>
-        <w:rPr>
-          <w:sz w:val="28"/>
-          <w:szCs w:val="28"/>
-          <w:lang w:val="en-US"/>
+        <w:t xml:space="preserve"> model captures the general trend in corruption crime numbers but struggles with extreme values and outliers. This suggests that while </w:t>
+      </w:r>
+      <w:proofErr w:type="spellStart"/>
+      <w:r>
+        <w:rPr>
+          <w:sz w:val="28"/>
+          <w:szCs w:val="28"/>
+          <w:lang w:val="en-US"/>
+        </w:rPr>
+        <w:t>kNN</w:t>
+      </w:r>
+      <w:proofErr w:type="spellEnd"/>
+      <w:r>
+        <w:rPr>
+          <w:sz w:val="28"/>
+          <w:szCs w:val="28"/>
+          <w:lang w:val="en-US"/>
+        </w:rPr>
+        <w:t xml:space="preserve"> can identify patterns in the data, it may not be the most reliable method for forecasting corruption crimes.</w:t>
+      </w:r>
+    </w:p>
+    <w:p>
+      <w:pPr>
+        <w:jc w:val="center"/>
+        <w:rPr>
+          <w:sz w:val="28"/>
+          <w:szCs w:val="28"/>
+          <w:lang w:val="en-US"/>
+        </w:rPr>
+      </w:pPr>
+      <w:r>
+        <w:rPr>
+          <w:noProof/>
+          <w:sz w:val="28"/>
+          <w:szCs w:val="28"/>
+          <w:lang w:eastAsia="ru-RU"/>
         </w:rPr>
         <w:lastRenderedPageBreak/>
-        <w:t xml:space="preserve">while </w:t>
-      </w:r>
-      <w:proofErr w:type="spellStart"/>
-      <w:r>
-        <w:rPr>
-          <w:sz w:val="28"/>
-          <w:szCs w:val="28"/>
-          <w:lang w:val="en-US"/>
-        </w:rPr>
-        <w:t>kNN</w:t>
-      </w:r>
-      <w:proofErr w:type="spellEnd"/>
-      <w:r>
-        <w:rPr>
-          <w:sz w:val="28"/>
-          <w:szCs w:val="28"/>
-          <w:lang w:val="en-US"/>
-        </w:rPr>
-        <w:t xml:space="preserve"> can identify patterns in the data, it may not be the most reliable method for forecasting corruption crimes.</w:t>
-      </w:r>
-    </w:p>
-    <w:p>
-      <w:pPr>
-        <w:jc w:val="center"/>
-        <w:rPr>
-          <w:sz w:val="28"/>
-          <w:szCs w:val="28"/>
-          <w:lang w:val="en-US"/>
-        </w:rPr>
-      </w:pPr>
-      <w:r>
-        <w:rPr>
-          <w:noProof/>
-          <w:sz w:val="28"/>
-          <w:szCs w:val="28"/>
-          <w:lang w:eastAsia="ru-RU"/>
-        </w:rPr>
         <w:drawing>
           <wp:inline distT="0" distB="0" distL="0" distR="0" wp14:anchorId="0C877B21" wp14:editId="448B6759">
             <wp:extent cx="4415634" cy="2808000"/>
@@ -8880,8 +8676,16 @@
           <w:szCs w:val="28"/>
           <w:lang w:val="en-US"/>
         </w:rPr>
+        <w:t xml:space="preserve">The results in Figure 4 indicate that Linear Regression provides the most accurate predictions, with minimal deviations from actual corruption crime </w:t>
+      </w:r>
+      <w:r>
+        <w:rPr>
+          <w:sz w:val="28"/>
+          <w:szCs w:val="28"/>
+          <w:lang w:val="en-US"/>
+        </w:rPr>
         <w:lastRenderedPageBreak/>
-        <w:t>The results in Figure 4 indicate that Linear Regression provides the most accurate predictions, with minimal deviations from actual corruption crime numbers. By fitting a linear equation to the dataset, the model successfully generalizes patterns and delivers highly precise forecasts.</w:t>
+        <w:t>numbers. By fitting a linear equation to the dataset, the model successfully generalizes patterns and delivers highly precise forecasts.</w:t>
       </w:r>
     </w:p>
     <w:p>
@@ -9083,25 +8887,7 @@
           <w:szCs w:val="28"/>
           <w:lang w:val="en-US"/>
         </w:rPr>
-        <w:t xml:space="preserve">These findings suggest that future research should explore feature selection techniques to determine which variables contribute most to </w:t>
-      </w:r>
-      <w:proofErr w:type="gramStart"/>
-      <w:r>
-        <w:rPr>
-          <w:sz w:val="28"/>
-          <w:szCs w:val="28"/>
-          <w:lang w:val="en-US"/>
-        </w:rPr>
-        <w:t>corruption</w:t>
-      </w:r>
-      <w:proofErr w:type="gramEnd"/>
-      <w:r>
-        <w:rPr>
-          <w:sz w:val="28"/>
-          <w:szCs w:val="28"/>
-          <w:lang w:val="en-US"/>
-        </w:rPr>
-        <w:t xml:space="preserve"> crime trends. Additionally, incorporating external socio-economic indicators and testing hybrid models could provide deeper insights into the factors driving corruption in Kazakhstan.</w:t>
+        <w:t>These findings suggest that future research should explore feature selection techniques to determine which variables contribute most to corruption crime trends. Additionally, incorporating external socio-economic indicators and testing hybrid models could provide deeper insights into the factors driving corruption in Kazakhstan.</w:t>
       </w:r>
     </w:p>
     <w:p>
@@ -9222,7 +9008,25 @@
           <w:szCs w:val="28"/>
           <w:lang w:val="en-US"/>
         </w:rPr>
-        <w:t xml:space="preserve">, which demonstrated strong resilience in handling </w:t>
+        <w:t xml:space="preserve">, which demonstrated strong resilience in handling variations in corruption crime trends. Although the </w:t>
+      </w:r>
+      <w:proofErr w:type="spellStart"/>
+      <w:r>
+        <w:rPr>
+          <w:sz w:val="28"/>
+          <w:szCs w:val="28"/>
+          <w:lang w:val="en-US"/>
+        </w:rPr>
+        <w:t>kNN</w:t>
+      </w:r>
+      <w:proofErr w:type="spellEnd"/>
+      <w:r>
+        <w:rPr>
+          <w:sz w:val="28"/>
+          <w:szCs w:val="28"/>
+          <w:lang w:val="en-US"/>
+        </w:rPr>
+        <w:t xml:space="preserve"> model effectively captured general patterns, it exhibited limitations in predicting extreme values and outliers. </w:t>
       </w:r>
       <w:r>
         <w:rPr>
@@ -9231,25 +9035,7 @@
           <w:lang w:val="en-US"/>
         </w:rPr>
         <w:lastRenderedPageBreak/>
-        <w:t xml:space="preserve">variations in corruption crime trends. Although the </w:t>
-      </w:r>
-      <w:proofErr w:type="spellStart"/>
-      <w:r>
-        <w:rPr>
-          <w:sz w:val="28"/>
-          <w:szCs w:val="28"/>
-          <w:lang w:val="en-US"/>
-        </w:rPr>
-        <w:t>kNN</w:t>
-      </w:r>
-      <w:proofErr w:type="spellEnd"/>
-      <w:r>
-        <w:rPr>
-          <w:sz w:val="28"/>
-          <w:szCs w:val="28"/>
-          <w:lang w:val="en-US"/>
-        </w:rPr>
-        <w:t xml:space="preserve"> model effectively captured general patterns, it exhibited limitations in predicting extreme values and outliers. These findings suggest that machine learning techniques can serve as effective tools for forecasting corruption crime trends, with Linear Regression and </w:t>
+        <w:t xml:space="preserve">These findings suggest that machine learning techniques can serve as effective tools for forecasting corruption crime trends, with Linear Regression and </w:t>
       </w:r>
       <w:proofErr w:type="spellStart"/>
       <w:r>
@@ -9567,34 +9353,34 @@
           <w:szCs w:val="28"/>
           <w:lang w:val="en-US"/>
         </w:rPr>
+        <w:t>REFERENCES</w:t>
+      </w:r>
+    </w:p>
+    <w:p>
+      <w:pPr>
+        <w:jc w:val="center"/>
+        <w:rPr>
+          <w:sz w:val="28"/>
+          <w:szCs w:val="28"/>
+          <w:lang w:val="en-US"/>
+        </w:rPr>
+      </w:pPr>
+    </w:p>
+    <w:p>
+      <w:pPr>
+        <w:rPr>
+          <w:sz w:val="28"/>
+          <w:szCs w:val="28"/>
+          <w:lang w:val="en-US"/>
+        </w:rPr>
+      </w:pPr>
+      <w:r>
+        <w:rPr>
+          <w:sz w:val="28"/>
+          <w:szCs w:val="28"/>
+          <w:lang w:val="en-US"/>
+        </w:rPr>
         <w:lastRenderedPageBreak/>
-        <w:t>REFERENCES</w:t>
-      </w:r>
-    </w:p>
-    <w:p>
-      <w:pPr>
-        <w:jc w:val="center"/>
-        <w:rPr>
-          <w:sz w:val="28"/>
-          <w:szCs w:val="28"/>
-          <w:lang w:val="en-US"/>
-        </w:rPr>
-      </w:pPr>
-    </w:p>
-    <w:p>
-      <w:pPr>
-        <w:rPr>
-          <w:sz w:val="28"/>
-          <w:szCs w:val="28"/>
-          <w:lang w:val="en-US"/>
-        </w:rPr>
-      </w:pPr>
-      <w:r>
-        <w:rPr>
-          <w:sz w:val="28"/>
-          <w:szCs w:val="28"/>
-          <w:lang w:val="en-US"/>
-        </w:rPr>
         <w:t xml:space="preserve">[1] Transparency International, "2023 corruption perceptions index: Explore the," [Online]. Available: https://www.transparency.org/en/cpi/2023/. [Accessed: Mar. 11, 2025].  </w:t>
       </w:r>
     </w:p>
@@ -9850,24 +9636,24 @@
           <w:szCs w:val="28"/>
           <w:lang w:val="en-US"/>
         </w:rPr>
+        <w:t xml:space="preserve">[16] V. J. Straub, D. Morgan, and J. Bertot, Government Information Quarterly 40, 101749 (2023). https://doi.org/10.1016/j.giq.2022.101749.  </w:t>
+      </w:r>
+    </w:p>
+    <w:p>
+      <w:pPr>
+        <w:rPr>
+          <w:sz w:val="28"/>
+          <w:szCs w:val="28"/>
+          <w:lang w:val="en-US"/>
+        </w:rPr>
+      </w:pPr>
+      <w:r>
+        <w:rPr>
+          <w:sz w:val="28"/>
+          <w:szCs w:val="28"/>
+          <w:lang w:val="en-US"/>
+        </w:rPr>
         <w:lastRenderedPageBreak/>
-        <w:t xml:space="preserve">[16] V. J. Straub, D. Morgan, and J. Bertot, Government Information Quarterly 40, 101749 (2023). https://doi.org/10.1016/j.giq.2022.101749.  </w:t>
-      </w:r>
-    </w:p>
-    <w:p>
-      <w:pPr>
-        <w:rPr>
-          <w:sz w:val="28"/>
-          <w:szCs w:val="28"/>
-          <w:lang w:val="en-US"/>
-        </w:rPr>
-      </w:pPr>
-      <w:r>
-        <w:rPr>
-          <w:sz w:val="28"/>
-          <w:szCs w:val="28"/>
-          <w:lang w:val="en-US"/>
-        </w:rPr>
         <w:t xml:space="preserve">[17] I. Adam and M. Fazekas, Information Economics and Policy 54, 100880 (2021). https://doi.org/10.1016/j.infoecopol.2020.100880.  </w:t>
       </w:r>
     </w:p>

</xml_diff>